<commit_message>
2.4 Commit: Developing Log
</commit_message>
<xml_diff>
--- a/1.21 Downloading and uploading data.docx
+++ b/1.21 Downloading and uploading data.docx
@@ -490,7 +490,23 @@
           <w:color w:val="0D0D0D" w:themeColor="text1" w:themeTint="F2"/>
           <w:lang w:val="en-IE"/>
         </w:rPr>
-        <w:t>: returning all content from the student and event tabs in the spreadsheet.</w:t>
+        <w:t>: returning all content from the student and event tabs in the spreadsheet</w:t>
+      </w:r>
+      <w:r>
+        <w:rPr>
+          <w:rFonts w:ascii="Times New Roman" w:hAnsi="Times New Roman" w:cs="Times New Roman"/>
+          <w:color w:val="0D0D0D" w:themeColor="text1" w:themeTint="F2"/>
+          <w:lang w:val="en-IE"/>
+        </w:rPr>
+        <w:t xml:space="preserve"> (As shown in Fig. R1)</w:t>
+      </w:r>
+      <w:r>
+        <w:rPr>
+          <w:rFonts w:ascii="Times New Roman" w:hAnsi="Times New Roman" w:cs="Times New Roman"/>
+          <w:color w:val="0D0D0D" w:themeColor="text1" w:themeTint="F2"/>
+          <w:lang w:val="en-IE"/>
+        </w:rPr>
+        <w:t>.</w:t>
       </w:r>
     </w:p>
     <w:p>
@@ -516,9 +532,9 @@
           <w:lang w:val="en-US"/>
         </w:rPr>
         <w:drawing>
-          <wp:inline distT="0" distB="0" distL="0" distR="0" wp14:anchorId="487BA778" wp14:editId="6A8A4C67">
+          <wp:inline distT="0" distB="0" distL="0" distR="0" wp14:anchorId="487BA778" wp14:editId="4D589521">
             <wp:extent cx="2431312" cy="1947647"/>
-            <wp:effectExtent l="0" t="0" r="0" b="0"/>
+            <wp:effectExtent l="76200" t="76200" r="71120" b="71755"/>
             <wp:docPr id="1645072155" name="Picture 2" descr="A diagram of a flowchart&#10;&#10;AI-generated content may be incorrect."/>
             <wp:cNvGraphicFramePr>
               <a:graphicFrameLocks xmlns:a="http://schemas.openxmlformats.org/drawingml/2006/main" noChangeAspect="1"/>
@@ -550,6 +566,13 @@
                     <a:prstGeom prst="rect">
                       <a:avLst/>
                     </a:prstGeom>
+                    <a:ln w="76200">
+                      <a:solidFill>
+                        <a:schemeClr val="bg1">
+                          <a:lumMod val="65000"/>
+                        </a:schemeClr>
+                      </a:solidFill>
+                    </a:ln>
                   </pic:spPr>
                 </pic:pic>
               </a:graphicData>
@@ -574,302 +597,69 @@
     </w:p>
     <w:p>
       <w:pPr>
-        <w:spacing w:line="276" w:lineRule="auto"/>
-        <w:ind w:left="720" w:firstLine="720"/>
-        <w:rPr>
-          <w:rFonts w:ascii="Times New Roman" w:hAnsi="Times New Roman" w:cs="Times New Roman"/>
-          <w:color w:val="0D0D0D" w:themeColor="text1" w:themeTint="F2"/>
-          <w:lang w:val="en-IE"/>
-        </w:rPr>
-      </w:pPr>
-      <w:r>
-        <w:rPr>
-          <w:rFonts w:ascii="Times New Roman" w:hAnsi="Times New Roman" w:cs="Times New Roman"/>
-          <w:color w:val="0D0D0D" w:themeColor="text1" w:themeTint="F2"/>
-          <w:lang w:val="en-IE"/>
-        </w:rPr>
-        <w:t>After receiving the content returned by the spreadsheet, the program organizes it into</w:t>
-      </w:r>
-      <w:r>
-        <w:rPr>
-          <w:rFonts w:ascii="Times New Roman" w:hAnsi="Times New Roman" w:cs="Times New Roman" w:hint="eastAsia"/>
-          <w:color w:val="0D0D0D" w:themeColor="text1" w:themeTint="F2"/>
-          <w:lang w:val="en-IE"/>
-        </w:rPr>
-        <w:t xml:space="preserve"> </w:t>
-      </w:r>
-      <w:r>
-        <w:rPr>
-          <w:rFonts w:ascii="Times New Roman" w:hAnsi="Times New Roman" w:cs="Times New Roman"/>
-          <w:color w:val="0B769F" w:themeColor="accent4" w:themeShade="BF"/>
+        <w:spacing w:after="0" w:line="240" w:lineRule="auto"/>
+        <w:jc w:val="center"/>
+        <w:rPr>
+          <w:rFonts w:ascii="Times New Roman" w:eastAsia="Times New Roman" w:hAnsi="Times New Roman" w:cs="Times New Roman"/>
+          <w:kern w:val="0"/>
+          <w:lang w:val="en-IE"/>
+          <w14:ligatures w14:val="none"/>
+        </w:rPr>
+      </w:pPr>
+      <w:r>
+        <w:rPr>
+          <w:rFonts w:ascii="Times New Roman" w:eastAsia="Times New Roman" w:hAnsi="Times New Roman" w:cs="Times New Roman"/>
+          <w:kern w:val="0"/>
+          <w:lang w:val="en-US"/>
+          <w14:ligatures w14:val="none"/>
+        </w:rPr>
+        <w:t xml:space="preserve">Figure R1. The </w:t>
+      </w:r>
+      <w:r>
+        <w:rPr>
+          <w:rFonts w:ascii="Times New Roman" w:eastAsia="Times New Roman" w:hAnsi="Times New Roman" w:cs="Times New Roman"/>
+          <w:kern w:val="0"/>
+          <w:lang w:val="en-IE"/>
+          <w14:ligatures w14:val="none"/>
+        </w:rPr>
+        <w:t xml:space="preserve">splitting structure of </w:t>
+      </w:r>
+      <w:proofErr w:type="spellStart"/>
+      <w:proofErr w:type="gramStart"/>
+      <w:r>
+        <w:rPr>
+          <w:rFonts w:ascii="Times New Roman" w:eastAsia="Times New Roman" w:hAnsi="Times New Roman" w:cs="Times New Roman"/>
+          <w:color w:val="0A2F41" w:themeColor="accent1" w:themeShade="80"/>
+          <w:kern w:val="0"/>
           <w:shd w:val="pct15" w:color="auto" w:fill="FFFFFF"/>
           <w:lang w:val="en-IE"/>
-        </w:rPr>
-        <w:t>students</w:t>
-      </w:r>
-      <w:r>
-        <w:rPr>
-          <w:rFonts w:ascii="Times New Roman" w:hAnsi="Times New Roman" w:cs="Times New Roman"/>
-          <w:color w:val="0D0D0D" w:themeColor="text1" w:themeTint="F2"/>
-          <w:lang w:val="en-IE"/>
-        </w:rPr>
-        <w:t xml:space="preserve"> and </w:t>
-      </w:r>
-      <w:r>
-        <w:rPr>
-          <w:rFonts w:ascii="Times New Roman" w:hAnsi="Times New Roman" w:cs="Times New Roman"/>
-          <w:color w:val="0B769F" w:themeColor="accent4" w:themeShade="BF"/>
+          <w14:ligatures w14:val="none"/>
+        </w:rPr>
+        <w:t>doGet</w:t>
+      </w:r>
+      <w:proofErr w:type="spellEnd"/>
+      <w:r>
+        <w:rPr>
+          <w:rFonts w:ascii="Times New Roman" w:eastAsia="Times New Roman" w:hAnsi="Times New Roman" w:cs="Times New Roman"/>
+          <w:color w:val="0A2F41" w:themeColor="accent1" w:themeShade="80"/>
+          <w:kern w:val="0"/>
           <w:shd w:val="pct15" w:color="auto" w:fill="FFFFFF"/>
           <w:lang w:val="en-IE"/>
-        </w:rPr>
-        <w:t>events</w:t>
-      </w:r>
-      <w:r>
-        <w:rPr>
-          <w:rFonts w:ascii="Times New Roman" w:hAnsi="Times New Roman" w:cs="Times New Roman" w:hint="eastAsia"/>
-          <w:color w:val="000000" w:themeColor="text1"/>
-          <w:lang w:val="en-IE"/>
-        </w:rPr>
-        <w:t xml:space="preserve"> arrays</w:t>
-      </w:r>
-      <w:r>
-        <w:rPr>
-          <w:rFonts w:ascii="Times New Roman" w:hAnsi="Times New Roman" w:cs="Times New Roman"/>
-          <w:color w:val="0D0D0D" w:themeColor="text1" w:themeTint="F2"/>
-          <w:lang w:val="en-IE"/>
-        </w:rPr>
-        <w:t xml:space="preserve">. Then, it recalculates the student scores based on the </w:t>
-      </w:r>
-      <w:r>
-        <w:rPr>
-          <w:rFonts w:ascii="Times New Roman" w:hAnsi="Times New Roman" w:cs="Times New Roman"/>
-          <w:color w:val="0B769F" w:themeColor="accent4" w:themeShade="BF"/>
+          <w14:ligatures w14:val="none"/>
+        </w:rPr>
+        <w:t>(</w:t>
+      </w:r>
+      <w:proofErr w:type="gramEnd"/>
+      <w:r>
+        <w:rPr>
+          <w:rFonts w:ascii="Times New Roman" w:eastAsia="Times New Roman" w:hAnsi="Times New Roman" w:cs="Times New Roman"/>
+          <w:color w:val="0A2F41" w:themeColor="accent1" w:themeShade="80"/>
+          <w:kern w:val="0"/>
           <w:shd w:val="pct15" w:color="auto" w:fill="FFFFFF"/>
           <w:lang w:val="en-IE"/>
-        </w:rPr>
-        <w:t>events</w:t>
-      </w:r>
-      <w:r>
-        <w:rPr>
-          <w:rFonts w:ascii="Times New Roman" w:hAnsi="Times New Roman" w:cs="Times New Roman"/>
-          <w:color w:val="0B769F" w:themeColor="accent4" w:themeShade="BF"/>
-          <w:lang w:val="en-IE"/>
-        </w:rPr>
-        <w:t xml:space="preserve"> </w:t>
-      </w:r>
-      <w:r>
-        <w:rPr>
-          <w:rFonts w:ascii="Times New Roman" w:hAnsi="Times New Roman" w:cs="Times New Roman"/>
-          <w:color w:val="0D0D0D" w:themeColor="text1" w:themeTint="F2"/>
-          <w:lang w:val="en-IE"/>
-        </w:rPr>
-        <w:t xml:space="preserve">array and re-renders the entire </w:t>
-      </w:r>
-      <w:r>
-        <w:rPr>
-          <w:rFonts w:ascii="Times New Roman" w:hAnsi="Times New Roman" w:cs="Times New Roman"/>
-          <w:color w:val="0D0D0D" w:themeColor="text1" w:themeTint="F2"/>
-          <w:lang w:val="en-IE"/>
-        </w:rPr>
-        <w:t>web app.</w:t>
-      </w:r>
-    </w:p>
-    <w:p>
-      <w:pPr>
-        <w:spacing w:line="276" w:lineRule="auto"/>
-        <w:ind w:firstLine="360"/>
-        <w:rPr>
-          <w:rFonts w:ascii="Times New Roman" w:hAnsi="Times New Roman" w:cs="Times New Roman"/>
-          <w:b/>
-          <w:bCs/>
-          <w:color w:val="0D0D0D" w:themeColor="text1" w:themeTint="F2"/>
-          <w:lang w:val="en-IE"/>
-        </w:rPr>
-      </w:pPr>
-      <w:r>
-        <w:rPr>
-          <w:rFonts w:ascii="Times New Roman" w:hAnsi="Times New Roman" w:cs="Times New Roman"/>
-          <w:b/>
-          <w:bCs/>
-          <w:color w:val="0D0D0D" w:themeColor="text1" w:themeTint="F2"/>
-          <w:lang w:val="en-IE"/>
-        </w:rPr>
-        <w:t>Uploading module:</w:t>
-      </w:r>
-    </w:p>
-    <w:p>
-      <w:pPr>
-        <w:spacing w:line="276" w:lineRule="auto"/>
-        <w:ind w:left="720" w:firstLine="720"/>
-        <w:rPr>
-          <w:rFonts w:ascii="Times New Roman" w:hAnsi="Times New Roman" w:cs="Times New Roman"/>
-          <w:color w:val="0D0D0D" w:themeColor="text1" w:themeTint="F2"/>
-          <w:lang w:val="en-IE"/>
-        </w:rPr>
-      </w:pPr>
-      <w:r>
-        <w:rPr>
-          <w:rFonts w:ascii="Times New Roman" w:hAnsi="Times New Roman" w:cs="Times New Roman"/>
-          <w:color w:val="0D0D0D" w:themeColor="text1" w:themeTint="F2"/>
-          <w:lang w:val="en-IE"/>
-        </w:rPr>
-        <w:t xml:space="preserve">The uploading module can be divided into two sub-parts: </w:t>
-      </w:r>
-      <w:proofErr w:type="spellStart"/>
-      <w:r>
-        <w:rPr>
-          <w:rFonts w:ascii="Times New Roman" w:hAnsi="Times New Roman" w:cs="Times New Roman"/>
-          <w:color w:val="0B769F" w:themeColor="accent4" w:themeShade="BF"/>
-          <w:shd w:val="pct15" w:color="auto" w:fill="FFFFFF"/>
-          <w:lang w:val="en-IE"/>
-        </w:rPr>
-        <w:t>appendEvent</w:t>
-      </w:r>
-      <w:proofErr w:type="spellEnd"/>
-      <w:r>
-        <w:rPr>
-          <w:rFonts w:ascii="Times New Roman" w:hAnsi="Times New Roman" w:cs="Times New Roman"/>
-          <w:color w:val="0B769F" w:themeColor="accent4" w:themeShade="BF"/>
-          <w:shd w:val="pct15" w:color="auto" w:fill="FFFFFF"/>
-          <w:lang w:val="en-IE"/>
-        </w:rPr>
-        <w:t>()</w:t>
-      </w:r>
-      <w:r>
-        <w:rPr>
-          <w:rFonts w:ascii="Times New Roman" w:hAnsi="Times New Roman" w:cs="Times New Roman"/>
-          <w:color w:val="0B769F" w:themeColor="accent4" w:themeShade="BF"/>
-          <w:lang w:val="en-IE"/>
-        </w:rPr>
-        <w:t xml:space="preserve"> </w:t>
-      </w:r>
-      <w:r>
-        <w:rPr>
-          <w:rFonts w:ascii="Times New Roman" w:hAnsi="Times New Roman" w:cs="Times New Roman"/>
-          <w:color w:val="0D0D0D" w:themeColor="text1" w:themeTint="F2"/>
-          <w:lang w:val="en-IE"/>
-        </w:rPr>
-        <w:t xml:space="preserve">and </w:t>
-      </w:r>
-      <w:proofErr w:type="spellStart"/>
-      <w:r>
-        <w:rPr>
-          <w:rFonts w:ascii="Times New Roman" w:hAnsi="Times New Roman" w:cs="Times New Roman"/>
-          <w:color w:val="0B769F" w:themeColor="accent4" w:themeShade="BF"/>
-          <w:shd w:val="pct15" w:color="auto" w:fill="FFFFFF"/>
-          <w:lang w:val="en-IE"/>
-        </w:rPr>
-        <w:t>updateEvent</w:t>
-      </w:r>
-      <w:proofErr w:type="spellEnd"/>
-      <w:r>
-        <w:rPr>
-          <w:rFonts w:ascii="Times New Roman" w:hAnsi="Times New Roman" w:cs="Times New Roman"/>
-          <w:color w:val="0B769F" w:themeColor="accent4" w:themeShade="BF"/>
-          <w:shd w:val="pct15" w:color="auto" w:fill="FFFFFF"/>
-          <w:lang w:val="en-IE"/>
-        </w:rPr>
-        <w:t>().</w:t>
-      </w:r>
-      <w:r>
-        <w:rPr>
-          <w:rFonts w:ascii="Times New Roman" w:hAnsi="Times New Roman" w:cs="Times New Roman" w:hint="eastAsia"/>
-          <w:color w:val="0B769F" w:themeColor="accent4" w:themeShade="BF"/>
-          <w:lang w:val="en-IE"/>
-        </w:rPr>
-        <w:t xml:space="preserve"> </w:t>
-      </w:r>
-      <w:r>
-        <w:rPr>
-          <w:rFonts w:ascii="Times New Roman" w:hAnsi="Times New Roman" w:cs="Times New Roman"/>
-          <w:color w:val="0D0D0D" w:themeColor="text1" w:themeTint="F2"/>
-          <w:lang w:val="en-IE"/>
-        </w:rPr>
-        <w:t xml:space="preserve">The principle is similar: send </w:t>
-      </w:r>
-      <w:r>
-        <w:rPr>
-          <w:rFonts w:ascii="Times New Roman" w:hAnsi="Times New Roman" w:cs="Times New Roman" w:hint="eastAsia"/>
-          <w:color w:val="0D0D0D" w:themeColor="text1" w:themeTint="F2"/>
-          <w:lang w:val="en-IE"/>
-        </w:rPr>
-        <w:t xml:space="preserve">request </w:t>
-      </w:r>
-      <w:r>
-        <w:rPr>
-          <w:rFonts w:ascii="Times New Roman" w:hAnsi="Times New Roman" w:cs="Times New Roman"/>
-          <w:color w:val="0D0D0D" w:themeColor="text1" w:themeTint="F2"/>
-          <w:lang w:val="en-IE"/>
-        </w:rPr>
-        <w:t xml:space="preserve">to the spreadsheet, and in </w:t>
-      </w:r>
-      <w:proofErr w:type="spellStart"/>
-      <w:r>
-        <w:rPr>
-          <w:rFonts w:ascii="Times New Roman" w:hAnsi="Times New Roman" w:cs="Times New Roman"/>
-          <w:color w:val="0B769F" w:themeColor="accent4" w:themeShade="BF"/>
-          <w:shd w:val="pct15" w:color="auto" w:fill="FFFFFF"/>
-          <w:lang w:val="en-IE"/>
-        </w:rPr>
-        <w:t>doPost</w:t>
-      </w:r>
-      <w:proofErr w:type="spellEnd"/>
-      <w:r>
-        <w:rPr>
-          <w:rFonts w:ascii="Times New Roman" w:hAnsi="Times New Roman" w:cs="Times New Roman"/>
-          <w:color w:val="0B769F" w:themeColor="accent4" w:themeShade="BF"/>
-          <w:shd w:val="pct15" w:color="auto" w:fill="FFFFFF"/>
-          <w:lang w:val="en-IE"/>
-        </w:rPr>
-        <w:t>()</w:t>
-      </w:r>
-      <w:r>
-        <w:rPr>
-          <w:rFonts w:ascii="Times New Roman" w:hAnsi="Times New Roman" w:cs="Times New Roman"/>
-          <w:lang w:val="en-IE"/>
-        </w:rPr>
-        <w:t xml:space="preserve">, </w:t>
-      </w:r>
-      <w:r>
-        <w:rPr>
-          <w:rFonts w:ascii="Times New Roman" w:hAnsi="Times New Roman" w:cs="Times New Roman"/>
-          <w:color w:val="0D0D0D" w:themeColor="text1" w:themeTint="F2"/>
-          <w:lang w:val="en-IE"/>
-        </w:rPr>
-        <w:t xml:space="preserve">distribute the </w:t>
-      </w:r>
-      <w:r>
-        <w:rPr>
-          <w:rFonts w:ascii="Times New Roman" w:hAnsi="Times New Roman" w:cs="Times New Roman"/>
-          <w:color w:val="0D0D0D" w:themeColor="text1" w:themeTint="F2"/>
-          <w:lang w:val="en-IE"/>
-        </w:rPr>
-        <w:t>operation</w:t>
-      </w:r>
-      <w:r>
-        <w:rPr>
-          <w:rFonts w:ascii="Times New Roman" w:hAnsi="Times New Roman" w:cs="Times New Roman"/>
-          <w:color w:val="0D0D0D" w:themeColor="text1" w:themeTint="F2"/>
-          <w:lang w:val="en-IE"/>
-        </w:rPr>
-        <w:t xml:space="preserve"> based on the </w:t>
-      </w:r>
-      <w:r>
-        <w:rPr>
-          <w:rFonts w:ascii="Times New Roman" w:hAnsi="Times New Roman" w:cs="Times New Roman"/>
-          <w:color w:val="0B769F" w:themeColor="accent4" w:themeShade="BF"/>
-          <w:shd w:val="pct15" w:color="auto" w:fill="FFFFFF"/>
-          <w:lang w:val="en-IE"/>
-        </w:rPr>
-        <w:t>action</w:t>
-      </w:r>
-      <w:r>
-        <w:rPr>
-          <w:rFonts w:ascii="Times New Roman" w:hAnsi="Times New Roman" w:cs="Times New Roman"/>
-          <w:color w:val="0D0D0D" w:themeColor="text1" w:themeTint="F2"/>
-          <w:lang w:val="en-IE"/>
-        </w:rPr>
-        <w:t>.</w:t>
+          <w14:ligatures w14:val="none"/>
+        </w:rPr>
+        <w:t>)</w:t>
       </w:r>
     </w:p>
     <w:p>
@@ -885,6 +675,328 @@
           <w14:ligatures w14:val="none"/>
         </w:rPr>
       </w:pPr>
+    </w:p>
+    <w:p>
+      <w:pPr>
+        <w:spacing w:line="276" w:lineRule="auto"/>
+        <w:ind w:left="720" w:firstLine="720"/>
+        <w:rPr>
+          <w:rFonts w:ascii="Times New Roman" w:hAnsi="Times New Roman" w:cs="Times New Roman"/>
+          <w:color w:val="0D0D0D" w:themeColor="text1" w:themeTint="F2"/>
+          <w:lang w:val="en-IE"/>
+        </w:rPr>
+      </w:pPr>
+      <w:r>
+        <w:rPr>
+          <w:rFonts w:ascii="Times New Roman" w:hAnsi="Times New Roman" w:cs="Times New Roman"/>
+          <w:color w:val="0D0D0D" w:themeColor="text1" w:themeTint="F2"/>
+          <w:lang w:val="en-IE"/>
+        </w:rPr>
+        <w:t>After receiving the content returned by the spreadsheet, the program organizes it into</w:t>
+      </w:r>
+      <w:r>
+        <w:rPr>
+          <w:rFonts w:ascii="Times New Roman" w:hAnsi="Times New Roman" w:cs="Times New Roman" w:hint="eastAsia"/>
+          <w:color w:val="0D0D0D" w:themeColor="text1" w:themeTint="F2"/>
+          <w:lang w:val="en-IE"/>
+        </w:rPr>
+        <w:t xml:space="preserve"> </w:t>
+      </w:r>
+      <w:r>
+        <w:rPr>
+          <w:rFonts w:ascii="Times New Roman" w:hAnsi="Times New Roman" w:cs="Times New Roman"/>
+          <w:color w:val="0B769F" w:themeColor="accent4" w:themeShade="BF"/>
+          <w:shd w:val="pct15" w:color="auto" w:fill="FFFFFF"/>
+          <w:lang w:val="en-IE"/>
+        </w:rPr>
+        <w:t>students</w:t>
+      </w:r>
+      <w:r>
+        <w:rPr>
+          <w:rFonts w:ascii="Times New Roman" w:hAnsi="Times New Roman" w:cs="Times New Roman"/>
+          <w:color w:val="0D0D0D" w:themeColor="text1" w:themeTint="F2"/>
+          <w:lang w:val="en-IE"/>
+        </w:rPr>
+        <w:t xml:space="preserve"> and </w:t>
+      </w:r>
+      <w:r>
+        <w:rPr>
+          <w:rFonts w:ascii="Times New Roman" w:hAnsi="Times New Roman" w:cs="Times New Roman"/>
+          <w:color w:val="0B769F" w:themeColor="accent4" w:themeShade="BF"/>
+          <w:shd w:val="pct15" w:color="auto" w:fill="FFFFFF"/>
+          <w:lang w:val="en-IE"/>
+        </w:rPr>
+        <w:t>events</w:t>
+      </w:r>
+      <w:r>
+        <w:rPr>
+          <w:rFonts w:ascii="Times New Roman" w:hAnsi="Times New Roman" w:cs="Times New Roman" w:hint="eastAsia"/>
+          <w:color w:val="000000" w:themeColor="text1"/>
+          <w:lang w:val="en-IE"/>
+        </w:rPr>
+        <w:t xml:space="preserve"> arrays</w:t>
+      </w:r>
+      <w:r>
+        <w:rPr>
+          <w:rFonts w:ascii="Times New Roman" w:hAnsi="Times New Roman" w:cs="Times New Roman"/>
+          <w:color w:val="0D0D0D" w:themeColor="text1" w:themeTint="F2"/>
+          <w:lang w:val="en-IE"/>
+        </w:rPr>
+        <w:t xml:space="preserve">. Then, it recalculates the student scores based on the </w:t>
+      </w:r>
+      <w:r>
+        <w:rPr>
+          <w:rFonts w:ascii="Times New Roman" w:hAnsi="Times New Roman" w:cs="Times New Roman"/>
+          <w:color w:val="0B769F" w:themeColor="accent4" w:themeShade="BF"/>
+          <w:shd w:val="pct15" w:color="auto" w:fill="FFFFFF"/>
+          <w:lang w:val="en-IE"/>
+        </w:rPr>
+        <w:t>events</w:t>
+      </w:r>
+      <w:r>
+        <w:rPr>
+          <w:rFonts w:ascii="Times New Roman" w:hAnsi="Times New Roman" w:cs="Times New Roman"/>
+          <w:color w:val="0B769F" w:themeColor="accent4" w:themeShade="BF"/>
+          <w:lang w:val="en-IE"/>
+        </w:rPr>
+        <w:t xml:space="preserve"> </w:t>
+      </w:r>
+      <w:r>
+        <w:rPr>
+          <w:rFonts w:ascii="Times New Roman" w:hAnsi="Times New Roman" w:cs="Times New Roman"/>
+          <w:color w:val="0D0D0D" w:themeColor="text1" w:themeTint="F2"/>
+          <w:lang w:val="en-IE"/>
+        </w:rPr>
+        <w:t xml:space="preserve">array and re-renders the entire </w:t>
+      </w:r>
+      <w:r>
+        <w:rPr>
+          <w:rFonts w:ascii="Times New Roman" w:hAnsi="Times New Roman" w:cs="Times New Roman"/>
+          <w:color w:val="0D0D0D" w:themeColor="text1" w:themeTint="F2"/>
+          <w:lang w:val="en-IE"/>
+        </w:rPr>
+        <w:t>web app.</w:t>
+      </w:r>
+    </w:p>
+    <w:p>
+      <w:pPr>
+        <w:spacing w:line="276" w:lineRule="auto"/>
+        <w:ind w:firstLine="360"/>
+        <w:rPr>
+          <w:rFonts w:ascii="Times New Roman" w:hAnsi="Times New Roman" w:cs="Times New Roman"/>
+          <w:b/>
+          <w:bCs/>
+          <w:color w:val="0D0D0D" w:themeColor="text1" w:themeTint="F2"/>
+          <w:lang w:val="en-IE"/>
+        </w:rPr>
+      </w:pPr>
+      <w:r>
+        <w:rPr>
+          <w:rFonts w:ascii="Times New Roman" w:hAnsi="Times New Roman" w:cs="Times New Roman"/>
+          <w:b/>
+          <w:bCs/>
+          <w:color w:val="0D0D0D" w:themeColor="text1" w:themeTint="F2"/>
+          <w:lang w:val="en-IE"/>
+        </w:rPr>
+        <w:t>Uploading module:</w:t>
+      </w:r>
+    </w:p>
+    <w:p>
+      <w:pPr>
+        <w:spacing w:line="276" w:lineRule="auto"/>
+        <w:ind w:left="720" w:firstLine="720"/>
+        <w:rPr>
+          <w:rFonts w:ascii="Times New Roman" w:hAnsi="Times New Roman" w:cs="Times New Roman"/>
+          <w:color w:val="0D0D0D" w:themeColor="text1" w:themeTint="F2"/>
+          <w:lang w:val="en-IE"/>
+        </w:rPr>
+      </w:pPr>
+      <w:r>
+        <w:rPr>
+          <w:rFonts w:ascii="Times New Roman" w:hAnsi="Times New Roman" w:cs="Times New Roman"/>
+          <w:color w:val="0D0D0D" w:themeColor="text1" w:themeTint="F2"/>
+          <w:lang w:val="en-IE"/>
+        </w:rPr>
+        <w:t xml:space="preserve">The uploading module can be divided into two sub-parts: </w:t>
+      </w:r>
+      <w:proofErr w:type="spellStart"/>
+      <w:r>
+        <w:rPr>
+          <w:rFonts w:ascii="Times New Roman" w:hAnsi="Times New Roman" w:cs="Times New Roman"/>
+          <w:color w:val="0B769F" w:themeColor="accent4" w:themeShade="BF"/>
+          <w:shd w:val="pct15" w:color="auto" w:fill="FFFFFF"/>
+          <w:lang w:val="en-IE"/>
+        </w:rPr>
+        <w:t>appendEvent</w:t>
+      </w:r>
+      <w:proofErr w:type="spellEnd"/>
+      <w:r>
+        <w:rPr>
+          <w:rFonts w:ascii="Times New Roman" w:hAnsi="Times New Roman" w:cs="Times New Roman"/>
+          <w:color w:val="0B769F" w:themeColor="accent4" w:themeShade="BF"/>
+          <w:shd w:val="pct15" w:color="auto" w:fill="FFFFFF"/>
+          <w:lang w:val="en-IE"/>
+        </w:rPr>
+        <w:t>()</w:t>
+      </w:r>
+      <w:r>
+        <w:rPr>
+          <w:rFonts w:ascii="Times New Roman" w:hAnsi="Times New Roman" w:cs="Times New Roman"/>
+          <w:color w:val="0B769F" w:themeColor="accent4" w:themeShade="BF"/>
+          <w:lang w:val="en-IE"/>
+        </w:rPr>
+        <w:t xml:space="preserve"> </w:t>
+      </w:r>
+      <w:r>
+        <w:rPr>
+          <w:rFonts w:ascii="Times New Roman" w:hAnsi="Times New Roman" w:cs="Times New Roman"/>
+          <w:color w:val="0D0D0D" w:themeColor="text1" w:themeTint="F2"/>
+          <w:lang w:val="en-IE"/>
+        </w:rPr>
+        <w:t xml:space="preserve">and </w:t>
+      </w:r>
+      <w:proofErr w:type="spellStart"/>
+      <w:r>
+        <w:rPr>
+          <w:rFonts w:ascii="Times New Roman" w:hAnsi="Times New Roman" w:cs="Times New Roman"/>
+          <w:color w:val="0B769F" w:themeColor="accent4" w:themeShade="BF"/>
+          <w:shd w:val="pct15" w:color="auto" w:fill="FFFFFF"/>
+          <w:lang w:val="en-IE"/>
+        </w:rPr>
+        <w:t>updateEvent</w:t>
+      </w:r>
+      <w:proofErr w:type="spellEnd"/>
+      <w:r>
+        <w:rPr>
+          <w:rFonts w:ascii="Times New Roman" w:hAnsi="Times New Roman" w:cs="Times New Roman"/>
+          <w:color w:val="0B769F" w:themeColor="accent4" w:themeShade="BF"/>
+          <w:shd w:val="pct15" w:color="auto" w:fill="FFFFFF"/>
+          <w:lang w:val="en-IE"/>
+        </w:rPr>
+        <w:t>().</w:t>
+      </w:r>
+      <w:r>
+        <w:rPr>
+          <w:rFonts w:ascii="Times New Roman" w:hAnsi="Times New Roman" w:cs="Times New Roman" w:hint="eastAsia"/>
+          <w:color w:val="0B769F" w:themeColor="accent4" w:themeShade="BF"/>
+          <w:lang w:val="en-IE"/>
+        </w:rPr>
+        <w:t xml:space="preserve"> </w:t>
+      </w:r>
+      <w:r>
+        <w:rPr>
+          <w:rFonts w:ascii="Times New Roman" w:hAnsi="Times New Roman" w:cs="Times New Roman"/>
+          <w:color w:val="0D0D0D" w:themeColor="text1" w:themeTint="F2"/>
+          <w:lang w:val="en-IE"/>
+        </w:rPr>
+        <w:t xml:space="preserve">The principle is similar: send </w:t>
+      </w:r>
+      <w:r>
+        <w:rPr>
+          <w:rFonts w:ascii="Times New Roman" w:hAnsi="Times New Roman" w:cs="Times New Roman" w:hint="eastAsia"/>
+          <w:color w:val="0D0D0D" w:themeColor="text1" w:themeTint="F2"/>
+          <w:lang w:val="en-IE"/>
+        </w:rPr>
+        <w:t xml:space="preserve">request </w:t>
+      </w:r>
+      <w:r>
+        <w:rPr>
+          <w:rFonts w:ascii="Times New Roman" w:hAnsi="Times New Roman" w:cs="Times New Roman"/>
+          <w:color w:val="0D0D0D" w:themeColor="text1" w:themeTint="F2"/>
+          <w:lang w:val="en-IE"/>
+        </w:rPr>
+        <w:t xml:space="preserve">to the spreadsheet, and in </w:t>
+      </w:r>
+      <w:proofErr w:type="spellStart"/>
+      <w:r>
+        <w:rPr>
+          <w:rFonts w:ascii="Times New Roman" w:hAnsi="Times New Roman" w:cs="Times New Roman"/>
+          <w:color w:val="0B769F" w:themeColor="accent4" w:themeShade="BF"/>
+          <w:shd w:val="pct15" w:color="auto" w:fill="FFFFFF"/>
+          <w:lang w:val="en-IE"/>
+        </w:rPr>
+        <w:t>doPost</w:t>
+      </w:r>
+      <w:proofErr w:type="spellEnd"/>
+      <w:r>
+        <w:rPr>
+          <w:rFonts w:ascii="Times New Roman" w:hAnsi="Times New Roman" w:cs="Times New Roman"/>
+          <w:color w:val="0B769F" w:themeColor="accent4" w:themeShade="BF"/>
+          <w:shd w:val="pct15" w:color="auto" w:fill="FFFFFF"/>
+          <w:lang w:val="en-IE"/>
+        </w:rPr>
+        <w:t>()</w:t>
+      </w:r>
+      <w:r>
+        <w:rPr>
+          <w:rFonts w:ascii="Times New Roman" w:hAnsi="Times New Roman" w:cs="Times New Roman"/>
+          <w:lang w:val="en-IE"/>
+        </w:rPr>
+        <w:t xml:space="preserve">, </w:t>
+      </w:r>
+      <w:r>
+        <w:rPr>
+          <w:rFonts w:ascii="Times New Roman" w:hAnsi="Times New Roman" w:cs="Times New Roman"/>
+          <w:color w:val="0D0D0D" w:themeColor="text1" w:themeTint="F2"/>
+          <w:lang w:val="en-IE"/>
+        </w:rPr>
+        <w:t xml:space="preserve">distribute the </w:t>
+      </w:r>
+      <w:r>
+        <w:rPr>
+          <w:rFonts w:ascii="Times New Roman" w:hAnsi="Times New Roman" w:cs="Times New Roman"/>
+          <w:color w:val="0D0D0D" w:themeColor="text1" w:themeTint="F2"/>
+          <w:lang w:val="en-IE"/>
+        </w:rPr>
+        <w:t>operation</w:t>
+      </w:r>
+      <w:r>
+        <w:rPr>
+          <w:rFonts w:ascii="Times New Roman" w:hAnsi="Times New Roman" w:cs="Times New Roman"/>
+          <w:color w:val="0D0D0D" w:themeColor="text1" w:themeTint="F2"/>
+          <w:lang w:val="en-IE"/>
+        </w:rPr>
+        <w:t xml:space="preserve"> based on the </w:t>
+      </w:r>
+      <w:r>
+        <w:rPr>
+          <w:rFonts w:ascii="Times New Roman" w:hAnsi="Times New Roman" w:cs="Times New Roman"/>
+          <w:color w:val="0B769F" w:themeColor="accent4" w:themeShade="BF"/>
+          <w:shd w:val="pct15" w:color="auto" w:fill="FFFFFF"/>
+          <w:lang w:val="en-IE"/>
+        </w:rPr>
+        <w:t>action</w:t>
+      </w:r>
+      <w:r>
+        <w:rPr>
+          <w:rFonts w:ascii="Times New Roman" w:hAnsi="Times New Roman" w:cs="Times New Roman"/>
+          <w:color w:val="000000" w:themeColor="text1"/>
+          <w:lang w:val="en-IE"/>
+        </w:rPr>
+        <w:t xml:space="preserve"> (As shown in Fig.R2)</w:t>
+      </w:r>
+      <w:r>
+        <w:rPr>
+          <w:rFonts w:ascii="Times New Roman" w:hAnsi="Times New Roman" w:cs="Times New Roman"/>
+          <w:color w:val="000000" w:themeColor="text1"/>
+          <w:lang w:val="en-IE"/>
+        </w:rPr>
+        <w:t>.</w:t>
+      </w:r>
+    </w:p>
+    <w:p>
+      <w:pPr>
+        <w:spacing w:after="0" w:line="240" w:lineRule="auto"/>
+        <w:jc w:val="center"/>
+        <w:rPr>
+          <w:rFonts w:ascii="Calibri" w:eastAsia="Times New Roman" w:hAnsi="Calibri" w:cs="Calibri"/>
+          <w:kern w:val="0"/>
+          <w:sz w:val="22"/>
+          <w:szCs w:val="22"/>
+          <w:lang w:val="en-US"/>
+          <w14:ligatures w14:val="none"/>
+        </w:rPr>
+      </w:pPr>
       <w:r>
         <w:rPr>
           <w:rFonts w:ascii="Calibri" w:eastAsia="Times New Roman" w:hAnsi="Calibri" w:cs="Calibri"/>
@@ -896,9 +1008,9 @@
         </w:rPr>
         <w:lastRenderedPageBreak/>
         <w:drawing>
-          <wp:inline distT="0" distB="0" distL="0" distR="0" wp14:anchorId="1216A7A5" wp14:editId="684FD957">
-            <wp:extent cx="2959200" cy="1560535"/>
-            <wp:effectExtent l="0" t="0" r="0" b="1905"/>
+          <wp:inline distT="0" distB="0" distL="0" distR="0" wp14:anchorId="1216A7A5" wp14:editId="3F0F0E00">
+            <wp:extent cx="3749547" cy="1977325"/>
+            <wp:effectExtent l="76200" t="76200" r="73660" b="80645"/>
             <wp:docPr id="533008691" name="Picture 4" descr="A diagram of events with blue highlighters&#10;&#10;AI-generated content may be incorrect."/>
             <wp:cNvGraphicFramePr>
               <a:graphicFrameLocks xmlns:a="http://schemas.openxmlformats.org/drawingml/2006/main" noChangeAspect="1"/>
@@ -925,17 +1037,96 @@
                   <pic:spPr>
                     <a:xfrm>
                       <a:off x="0" y="0"/>
-                      <a:ext cx="2973304" cy="1567973"/>
+                      <a:ext cx="3780222" cy="1993502"/>
                     </a:xfrm>
                     <a:prstGeom prst="rect">
                       <a:avLst/>
                     </a:prstGeom>
+                    <a:ln w="76200">
+                      <a:solidFill>
+                        <a:schemeClr val="bg1">
+                          <a:lumMod val="65000"/>
+                        </a:schemeClr>
+                      </a:solidFill>
+                    </a:ln>
                   </pic:spPr>
                 </pic:pic>
               </a:graphicData>
             </a:graphic>
           </wp:inline>
         </w:drawing>
+      </w:r>
+    </w:p>
+    <w:p>
+      <w:pPr>
+        <w:spacing w:after="0" w:line="240" w:lineRule="auto"/>
+        <w:jc w:val="center"/>
+        <w:rPr>
+          <w:rFonts w:ascii="Calibri" w:eastAsia="Times New Roman" w:hAnsi="Calibri" w:cs="Calibri"/>
+          <w:kern w:val="0"/>
+          <w:sz w:val="22"/>
+          <w:szCs w:val="22"/>
+          <w:lang w:val="en-US"/>
+          <w14:ligatures w14:val="none"/>
+        </w:rPr>
+      </w:pPr>
+    </w:p>
+    <w:p>
+      <w:pPr>
+        <w:spacing w:after="0" w:line="240" w:lineRule="auto"/>
+        <w:jc w:val="center"/>
+        <w:rPr>
+          <w:rFonts w:ascii="Times New Roman" w:eastAsia="Times New Roman" w:hAnsi="Times New Roman" w:cs="Times New Roman"/>
+          <w:kern w:val="0"/>
+          <w:lang w:val="en-US"/>
+          <w14:ligatures w14:val="none"/>
+        </w:rPr>
+      </w:pPr>
+      <w:r>
+        <w:rPr>
+          <w:rFonts w:ascii="Times New Roman" w:eastAsia="Times New Roman" w:hAnsi="Times New Roman" w:cs="Times New Roman"/>
+          <w:kern w:val="0"/>
+          <w:lang w:val="en-US"/>
+          <w14:ligatures w14:val="none"/>
+        </w:rPr>
+        <w:t xml:space="preserve">Figure R2. The splitting structure of </w:t>
+      </w:r>
+      <w:proofErr w:type="spellStart"/>
+      <w:proofErr w:type="gramStart"/>
+      <w:r>
+        <w:rPr>
+          <w:rFonts w:ascii="Times New Roman" w:eastAsia="Times New Roman" w:hAnsi="Times New Roman" w:cs="Times New Roman"/>
+          <w:color w:val="0A2F41" w:themeColor="accent1" w:themeShade="80"/>
+          <w:kern w:val="0"/>
+          <w:shd w:val="pct15" w:color="auto" w:fill="FFFFFF"/>
+          <w:lang w:val="en-US"/>
+          <w14:ligatures w14:val="none"/>
+        </w:rPr>
+        <w:t>doPost</w:t>
+      </w:r>
+      <w:proofErr w:type="spellEnd"/>
+      <w:r>
+        <w:rPr>
+          <w:rFonts w:ascii="Times New Roman" w:eastAsia="Times New Roman" w:hAnsi="Times New Roman" w:cs="Times New Roman"/>
+          <w:color w:val="0A2F41" w:themeColor="accent1" w:themeShade="80"/>
+          <w:kern w:val="0"/>
+          <w:shd w:val="pct15" w:color="auto" w:fill="FFFFFF"/>
+          <w:lang w:val="en-US"/>
+          <w14:ligatures w14:val="none"/>
+        </w:rPr>
+        <w:t>(</w:t>
+      </w:r>
+      <w:proofErr w:type="gramEnd"/>
+      <w:r>
+        <w:rPr>
+          <w:rFonts w:ascii="Times New Roman" w:eastAsia="Times New Roman" w:hAnsi="Times New Roman" w:cs="Times New Roman"/>
+          <w:color w:val="0A2F41" w:themeColor="accent1" w:themeShade="80"/>
+          <w:kern w:val="0"/>
+          <w:shd w:val="pct15" w:color="auto" w:fill="FFFFFF"/>
+          <w:lang w:val="en-US"/>
+          <w14:ligatures w14:val="none"/>
+        </w:rPr>
+        <w:t>)</w:t>
       </w:r>
     </w:p>
     <w:p>
@@ -1685,17 +1876,7 @@
                 <w:szCs w:val="18"/>
                 <w:lang w:val="en-IE"/>
               </w:rPr>
-              <w:t>l</w:t>
-            </w:r>
-            <w:r>
-              <w:rPr>
-                <w:rFonts w:ascii="Times New Roman" w:hAnsi="Times New Roman" w:cs="Times New Roman"/>
-                <w:color w:val="0D0D0D" w:themeColor="text1" w:themeTint="F2"/>
-                <w:sz w:val="18"/>
-                <w:szCs w:val="18"/>
-                <w:lang w:val="en-IE"/>
-              </w:rPr>
-              <w:t>ow constraints require self-maintenance of format.</w:t>
+              <w:t>low constraints require self-maintenance of format.</w:t>
             </w:r>
           </w:p>
         </w:tc>
@@ -1858,6 +2039,7 @@
                 <w:szCs w:val="18"/>
                 <w:lang w:val="en-IE"/>
               </w:rPr>
+              <w:lastRenderedPageBreak/>
               <w:t>It has high learning value as a "legitimate cloud database".</w:t>
             </w:r>
           </w:p>
@@ -1891,6 +2073,7 @@
                 <w:szCs w:val="18"/>
                 <w:lang w:val="en-IE"/>
               </w:rPr>
+              <w:lastRenderedPageBreak/>
               <w:t>I</w:t>
             </w:r>
             <w:r>
@@ -1929,7 +2112,18 @@
                 <w:szCs w:val="18"/>
                 <w:lang w:val="en-IE"/>
               </w:rPr>
-              <w:t xml:space="preserve">For complex transactions or auditing/login consistency, a more rigorous design is required </w:t>
+              <w:t xml:space="preserve">For complex transactions or auditing/login consistency, </w:t>
+            </w:r>
+            <w:r>
+              <w:rPr>
+                <w:rFonts w:ascii="Times New Roman" w:hAnsi="Times New Roman" w:cs="Times New Roman"/>
+                <w:color w:val="0D0D0D" w:themeColor="text1" w:themeTint="F2"/>
+                <w:sz w:val="18"/>
+                <w:szCs w:val="18"/>
+                <w:lang w:val="en-IE"/>
+              </w:rPr>
+              <w:lastRenderedPageBreak/>
+              <w:t xml:space="preserve">a more rigorous design is required </w:t>
             </w:r>
           </w:p>
         </w:tc>

</xml_diff>